<commit_message>
feat: split Word documents that were never paginated into pages
docx-preview starts new pages only at explicit breaks and where Word
recorded its own breaks on the last save. Documents Word never laid
out, such as exports from other apps and generated files, showed as a
single long page.

After rendering, pages much taller than their paper size are now split
between blocks and between table rows, measured in one pass. Each new
page repeats the running header and footer, and notes move to the last
page. Pages that only overflow a little, because fonts differ from the
author's, are left alone.

The long fixture document gains a table longer than a page.
</commit_message>
<xml_diff>
--- a/test/fixtures/long.docx
+++ b/test/fixtures/long.docx
@@ -470,6 +470,1454 @@
         <w:t xml:space="preserve">In stable assumptions across across and detailed expanded risks markets assumptions assumptions customer team times improved remained. Along growth expanded detailed quarterly follow growth revenue the new expanded with and and. Along follow team regions detailed costs to quarterly customer costs. The the expanded team support along the next growth response. Outlines remained expanded with appendix quarterly detailed expanded along across across.</w:t>
       </w:r>
     </w:p>
+    <w:tbl>
+      <w:tblPr>
+        <w:tblW w:type="pct" w:w="5000"/>
+        <w:tblBorders>
+          <w:top w:val="single" w:color="auto" w:sz="4"/>
+          <w:left w:val="single" w:color="auto" w:sz="4"/>
+          <w:bottom w:val="single" w:color="auto" w:sz="4"/>
+          <w:right w:val="single" w:color="auto" w:sz="4"/>
+          <w:insideH w:val="single" w:color="auto" w:sz="4"/>
+          <w:insideV w:val="single" w:color="auto" w:sz="4"/>
+        </w:tblBorders>
+      </w:tblPr>
+      <w:tblGrid>
+        <w:gridCol w:w="3009"/>
+        <w:gridCol w:w="3009"/>
+        <w:gridCol w:w="3009"/>
+      </w:tblGrid>
+      <w:tr>
+        <w:trPr>
+          <w:tblHeader/>
+        </w:trPr>
+        <w:tc>
+          <w:tcPr>
+            <w:shd w:fill="1F4E79" w:color="auto" w:val="clear"/>
+          </w:tcPr>
+          <w:p>
+            <w:r>
+              <w:rPr>
+                <w:b/>
+                <w:bCs/>
+                <w:color w:val="FFFFFF"/>
+              </w:rPr>
+              <w:t xml:space="preserve">Week</w:t>
+            </w:r>
+          </w:p>
+        </w:tc>
+        <w:tc>
+          <w:tcPr>
+            <w:shd w:fill="1F4E79" w:color="auto" w:val="clear"/>
+          </w:tcPr>
+          <w:p>
+            <w:r>
+              <w:rPr>
+                <w:b/>
+                <w:bCs/>
+                <w:color w:val="FFFFFF"/>
+              </w:rPr>
+              <w:t xml:space="preserve">Orders</w:t>
+            </w:r>
+          </w:p>
+        </w:tc>
+        <w:tc>
+          <w:tcPr>
+            <w:shd w:fill="1F4E79" w:color="auto" w:val="clear"/>
+          </w:tcPr>
+          <w:p>
+            <w:r>
+              <w:rPr>
+                <w:b/>
+                <w:bCs/>
+                <w:color w:val="FFFFFF"/>
+              </w:rPr>
+              <w:t xml:space="preserve">Returns</w:t>
+            </w:r>
+          </w:p>
+        </w:tc>
+      </w:tr>
+      <w:tr>
+        <w:tc>
+          <w:p>
+            <w:r>
+              <w:t xml:space="preserve">Week 1</w:t>
+            </w:r>
+          </w:p>
+        </w:tc>
+        <w:tc>
+          <w:p>
+            <w:r>
+              <w:t xml:space="preserve">120</w:t>
+            </w:r>
+          </w:p>
+        </w:tc>
+        <w:tc>
+          <w:p>
+            <w:r>
+              <w:t xml:space="preserve">0</w:t>
+            </w:r>
+          </w:p>
+        </w:tc>
+      </w:tr>
+      <w:tr>
+        <w:tc>
+          <w:p>
+            <w:r>
+              <w:t xml:space="preserve">Week 2</w:t>
+            </w:r>
+          </w:p>
+        </w:tc>
+        <w:tc>
+          <w:p>
+            <w:r>
+              <w:t xml:space="preserve">123</w:t>
+            </w:r>
+          </w:p>
+        </w:tc>
+        <w:tc>
+          <w:p>
+            <w:r>
+              <w:t xml:space="preserve">1</w:t>
+            </w:r>
+          </w:p>
+        </w:tc>
+      </w:tr>
+      <w:tr>
+        <w:tc>
+          <w:p>
+            <w:r>
+              <w:t xml:space="preserve">Week 3</w:t>
+            </w:r>
+          </w:p>
+        </w:tc>
+        <w:tc>
+          <w:p>
+            <w:r>
+              <w:t xml:space="preserve">126</w:t>
+            </w:r>
+          </w:p>
+        </w:tc>
+        <w:tc>
+          <w:p>
+            <w:r>
+              <w:t xml:space="preserve">2</w:t>
+            </w:r>
+          </w:p>
+        </w:tc>
+      </w:tr>
+      <w:tr>
+        <w:tc>
+          <w:p>
+            <w:r>
+              <w:t xml:space="preserve">Week 4</w:t>
+            </w:r>
+          </w:p>
+        </w:tc>
+        <w:tc>
+          <w:p>
+            <w:r>
+              <w:t xml:space="preserve">129</w:t>
+            </w:r>
+          </w:p>
+        </w:tc>
+        <w:tc>
+          <w:p>
+            <w:r>
+              <w:t xml:space="preserve">3</w:t>
+            </w:r>
+          </w:p>
+        </w:tc>
+      </w:tr>
+      <w:tr>
+        <w:tc>
+          <w:p>
+            <w:r>
+              <w:t xml:space="preserve">Week 5</w:t>
+            </w:r>
+          </w:p>
+        </w:tc>
+        <w:tc>
+          <w:p>
+            <w:r>
+              <w:t xml:space="preserve">132</w:t>
+            </w:r>
+          </w:p>
+        </w:tc>
+        <w:tc>
+          <w:p>
+            <w:r>
+              <w:t xml:space="preserve">4</w:t>
+            </w:r>
+          </w:p>
+        </w:tc>
+      </w:tr>
+      <w:tr>
+        <w:tc>
+          <w:p>
+            <w:r>
+              <w:t xml:space="preserve">Week 6</w:t>
+            </w:r>
+          </w:p>
+        </w:tc>
+        <w:tc>
+          <w:p>
+            <w:r>
+              <w:t xml:space="preserve">135</w:t>
+            </w:r>
+          </w:p>
+        </w:tc>
+        <w:tc>
+          <w:p>
+            <w:r>
+              <w:t xml:space="preserve">5</w:t>
+            </w:r>
+          </w:p>
+        </w:tc>
+      </w:tr>
+      <w:tr>
+        <w:tc>
+          <w:p>
+            <w:r>
+              <w:t xml:space="preserve">Week 7</w:t>
+            </w:r>
+          </w:p>
+        </w:tc>
+        <w:tc>
+          <w:p>
+            <w:r>
+              <w:t xml:space="preserve">138</w:t>
+            </w:r>
+          </w:p>
+        </w:tc>
+        <w:tc>
+          <w:p>
+            <w:r>
+              <w:t xml:space="preserve">6</w:t>
+            </w:r>
+          </w:p>
+        </w:tc>
+      </w:tr>
+      <w:tr>
+        <w:tc>
+          <w:p>
+            <w:r>
+              <w:t xml:space="preserve">Week 8</w:t>
+            </w:r>
+          </w:p>
+        </w:tc>
+        <w:tc>
+          <w:p>
+            <w:r>
+              <w:t xml:space="preserve">141</w:t>
+            </w:r>
+          </w:p>
+        </w:tc>
+        <w:tc>
+          <w:p>
+            <w:r>
+              <w:t xml:space="preserve">0</w:t>
+            </w:r>
+          </w:p>
+        </w:tc>
+      </w:tr>
+      <w:tr>
+        <w:tc>
+          <w:p>
+            <w:r>
+              <w:t xml:space="preserve">Week 9</w:t>
+            </w:r>
+          </w:p>
+        </w:tc>
+        <w:tc>
+          <w:p>
+            <w:r>
+              <w:t xml:space="preserve">144</w:t>
+            </w:r>
+          </w:p>
+        </w:tc>
+        <w:tc>
+          <w:p>
+            <w:r>
+              <w:t xml:space="preserve">1</w:t>
+            </w:r>
+          </w:p>
+        </w:tc>
+      </w:tr>
+      <w:tr>
+        <w:tc>
+          <w:p>
+            <w:r>
+              <w:t xml:space="preserve">Week 10</w:t>
+            </w:r>
+          </w:p>
+        </w:tc>
+        <w:tc>
+          <w:p>
+            <w:r>
+              <w:t xml:space="preserve">147</w:t>
+            </w:r>
+          </w:p>
+        </w:tc>
+        <w:tc>
+          <w:p>
+            <w:r>
+              <w:t xml:space="preserve">2</w:t>
+            </w:r>
+          </w:p>
+        </w:tc>
+      </w:tr>
+      <w:tr>
+        <w:tc>
+          <w:p>
+            <w:r>
+              <w:t xml:space="preserve">Week 11</w:t>
+            </w:r>
+          </w:p>
+        </w:tc>
+        <w:tc>
+          <w:p>
+            <w:r>
+              <w:t xml:space="preserve">150</w:t>
+            </w:r>
+          </w:p>
+        </w:tc>
+        <w:tc>
+          <w:p>
+            <w:r>
+              <w:t xml:space="preserve">3</w:t>
+            </w:r>
+          </w:p>
+        </w:tc>
+      </w:tr>
+      <w:tr>
+        <w:tc>
+          <w:p>
+            <w:r>
+              <w:t xml:space="preserve">Week 12</w:t>
+            </w:r>
+          </w:p>
+        </w:tc>
+        <w:tc>
+          <w:p>
+            <w:r>
+              <w:t xml:space="preserve">153</w:t>
+            </w:r>
+          </w:p>
+        </w:tc>
+        <w:tc>
+          <w:p>
+            <w:r>
+              <w:t xml:space="preserve">4</w:t>
+            </w:r>
+          </w:p>
+        </w:tc>
+      </w:tr>
+      <w:tr>
+        <w:tc>
+          <w:p>
+            <w:r>
+              <w:t xml:space="preserve">Week 13</w:t>
+            </w:r>
+          </w:p>
+        </w:tc>
+        <w:tc>
+          <w:p>
+            <w:r>
+              <w:t xml:space="preserve">156</w:t>
+            </w:r>
+          </w:p>
+        </w:tc>
+        <w:tc>
+          <w:p>
+            <w:r>
+              <w:t xml:space="preserve">5</w:t>
+            </w:r>
+          </w:p>
+        </w:tc>
+      </w:tr>
+      <w:tr>
+        <w:tc>
+          <w:p>
+            <w:r>
+              <w:t xml:space="preserve">Week 14</w:t>
+            </w:r>
+          </w:p>
+        </w:tc>
+        <w:tc>
+          <w:p>
+            <w:r>
+              <w:t xml:space="preserve">159</w:t>
+            </w:r>
+          </w:p>
+        </w:tc>
+        <w:tc>
+          <w:p>
+            <w:r>
+              <w:t xml:space="preserve">6</w:t>
+            </w:r>
+          </w:p>
+        </w:tc>
+      </w:tr>
+      <w:tr>
+        <w:tc>
+          <w:p>
+            <w:r>
+              <w:t xml:space="preserve">Week 15</w:t>
+            </w:r>
+          </w:p>
+        </w:tc>
+        <w:tc>
+          <w:p>
+            <w:r>
+              <w:t xml:space="preserve">162</w:t>
+            </w:r>
+          </w:p>
+        </w:tc>
+        <w:tc>
+          <w:p>
+            <w:r>
+              <w:t xml:space="preserve">0</w:t>
+            </w:r>
+          </w:p>
+        </w:tc>
+      </w:tr>
+      <w:tr>
+        <w:tc>
+          <w:p>
+            <w:r>
+              <w:t xml:space="preserve">Week 16</w:t>
+            </w:r>
+          </w:p>
+        </w:tc>
+        <w:tc>
+          <w:p>
+            <w:r>
+              <w:t xml:space="preserve">165</w:t>
+            </w:r>
+          </w:p>
+        </w:tc>
+        <w:tc>
+          <w:p>
+            <w:r>
+              <w:t xml:space="preserve">1</w:t>
+            </w:r>
+          </w:p>
+        </w:tc>
+      </w:tr>
+      <w:tr>
+        <w:tc>
+          <w:p>
+            <w:r>
+              <w:t xml:space="preserve">Week 17</w:t>
+            </w:r>
+          </w:p>
+        </w:tc>
+        <w:tc>
+          <w:p>
+            <w:r>
+              <w:t xml:space="preserve">168</w:t>
+            </w:r>
+          </w:p>
+        </w:tc>
+        <w:tc>
+          <w:p>
+            <w:r>
+              <w:t xml:space="preserve">2</w:t>
+            </w:r>
+          </w:p>
+        </w:tc>
+      </w:tr>
+      <w:tr>
+        <w:tc>
+          <w:p>
+            <w:r>
+              <w:t xml:space="preserve">Week 18</w:t>
+            </w:r>
+          </w:p>
+        </w:tc>
+        <w:tc>
+          <w:p>
+            <w:r>
+              <w:t xml:space="preserve">171</w:t>
+            </w:r>
+          </w:p>
+        </w:tc>
+        <w:tc>
+          <w:p>
+            <w:r>
+              <w:t xml:space="preserve">3</w:t>
+            </w:r>
+          </w:p>
+        </w:tc>
+      </w:tr>
+      <w:tr>
+        <w:tc>
+          <w:p>
+            <w:r>
+              <w:t xml:space="preserve">Week 19</w:t>
+            </w:r>
+          </w:p>
+        </w:tc>
+        <w:tc>
+          <w:p>
+            <w:r>
+              <w:t xml:space="preserve">174</w:t>
+            </w:r>
+          </w:p>
+        </w:tc>
+        <w:tc>
+          <w:p>
+            <w:r>
+              <w:t xml:space="preserve">4</w:t>
+            </w:r>
+          </w:p>
+        </w:tc>
+      </w:tr>
+      <w:tr>
+        <w:tc>
+          <w:p>
+            <w:r>
+              <w:t xml:space="preserve">Week 20</w:t>
+            </w:r>
+          </w:p>
+        </w:tc>
+        <w:tc>
+          <w:p>
+            <w:r>
+              <w:t xml:space="preserve">177</w:t>
+            </w:r>
+          </w:p>
+        </w:tc>
+        <w:tc>
+          <w:p>
+            <w:r>
+              <w:t xml:space="preserve">5</w:t>
+            </w:r>
+          </w:p>
+        </w:tc>
+      </w:tr>
+      <w:tr>
+        <w:tc>
+          <w:p>
+            <w:r>
+              <w:t xml:space="preserve">Week 21</w:t>
+            </w:r>
+          </w:p>
+        </w:tc>
+        <w:tc>
+          <w:p>
+            <w:r>
+              <w:t xml:space="preserve">180</w:t>
+            </w:r>
+          </w:p>
+        </w:tc>
+        <w:tc>
+          <w:p>
+            <w:r>
+              <w:t xml:space="preserve">6</w:t>
+            </w:r>
+          </w:p>
+        </w:tc>
+      </w:tr>
+      <w:tr>
+        <w:tc>
+          <w:p>
+            <w:r>
+              <w:t xml:space="preserve">Week 22</w:t>
+            </w:r>
+          </w:p>
+        </w:tc>
+        <w:tc>
+          <w:p>
+            <w:r>
+              <w:t xml:space="preserve">183</w:t>
+            </w:r>
+          </w:p>
+        </w:tc>
+        <w:tc>
+          <w:p>
+            <w:r>
+              <w:t xml:space="preserve">0</w:t>
+            </w:r>
+          </w:p>
+        </w:tc>
+      </w:tr>
+      <w:tr>
+        <w:tc>
+          <w:p>
+            <w:r>
+              <w:t xml:space="preserve">Week 23</w:t>
+            </w:r>
+          </w:p>
+        </w:tc>
+        <w:tc>
+          <w:p>
+            <w:r>
+              <w:t xml:space="preserve">186</w:t>
+            </w:r>
+          </w:p>
+        </w:tc>
+        <w:tc>
+          <w:p>
+            <w:r>
+              <w:t xml:space="preserve">1</w:t>
+            </w:r>
+          </w:p>
+        </w:tc>
+      </w:tr>
+      <w:tr>
+        <w:tc>
+          <w:p>
+            <w:r>
+              <w:t xml:space="preserve">Week 24</w:t>
+            </w:r>
+          </w:p>
+        </w:tc>
+        <w:tc>
+          <w:p>
+            <w:r>
+              <w:t xml:space="preserve">189</w:t>
+            </w:r>
+          </w:p>
+        </w:tc>
+        <w:tc>
+          <w:p>
+            <w:r>
+              <w:t xml:space="preserve">2</w:t>
+            </w:r>
+          </w:p>
+        </w:tc>
+      </w:tr>
+      <w:tr>
+        <w:tc>
+          <w:p>
+            <w:r>
+              <w:t xml:space="preserve">Week 25</w:t>
+            </w:r>
+          </w:p>
+        </w:tc>
+        <w:tc>
+          <w:p>
+            <w:r>
+              <w:t xml:space="preserve">192</w:t>
+            </w:r>
+          </w:p>
+        </w:tc>
+        <w:tc>
+          <w:p>
+            <w:r>
+              <w:t xml:space="preserve">3</w:t>
+            </w:r>
+          </w:p>
+        </w:tc>
+      </w:tr>
+      <w:tr>
+        <w:tc>
+          <w:p>
+            <w:r>
+              <w:t xml:space="preserve">Week 26</w:t>
+            </w:r>
+          </w:p>
+        </w:tc>
+        <w:tc>
+          <w:p>
+            <w:r>
+              <w:t xml:space="preserve">195</w:t>
+            </w:r>
+          </w:p>
+        </w:tc>
+        <w:tc>
+          <w:p>
+            <w:r>
+              <w:t xml:space="preserve">4</w:t>
+            </w:r>
+          </w:p>
+        </w:tc>
+      </w:tr>
+      <w:tr>
+        <w:tc>
+          <w:p>
+            <w:r>
+              <w:t xml:space="preserve">Week 27</w:t>
+            </w:r>
+          </w:p>
+        </w:tc>
+        <w:tc>
+          <w:p>
+            <w:r>
+              <w:t xml:space="preserve">198</w:t>
+            </w:r>
+          </w:p>
+        </w:tc>
+        <w:tc>
+          <w:p>
+            <w:r>
+              <w:t xml:space="preserve">5</w:t>
+            </w:r>
+          </w:p>
+        </w:tc>
+      </w:tr>
+      <w:tr>
+        <w:tc>
+          <w:p>
+            <w:r>
+              <w:t xml:space="preserve">Week 28</w:t>
+            </w:r>
+          </w:p>
+        </w:tc>
+        <w:tc>
+          <w:p>
+            <w:r>
+              <w:t xml:space="preserve">201</w:t>
+            </w:r>
+          </w:p>
+        </w:tc>
+        <w:tc>
+          <w:p>
+            <w:r>
+              <w:t xml:space="preserve">6</w:t>
+            </w:r>
+          </w:p>
+        </w:tc>
+      </w:tr>
+      <w:tr>
+        <w:tc>
+          <w:p>
+            <w:r>
+              <w:t xml:space="preserve">Week 29</w:t>
+            </w:r>
+          </w:p>
+        </w:tc>
+        <w:tc>
+          <w:p>
+            <w:r>
+              <w:t xml:space="preserve">204</w:t>
+            </w:r>
+          </w:p>
+        </w:tc>
+        <w:tc>
+          <w:p>
+            <w:r>
+              <w:t xml:space="preserve">0</w:t>
+            </w:r>
+          </w:p>
+        </w:tc>
+      </w:tr>
+      <w:tr>
+        <w:tc>
+          <w:p>
+            <w:r>
+              <w:t xml:space="preserve">Week 30</w:t>
+            </w:r>
+          </w:p>
+        </w:tc>
+        <w:tc>
+          <w:p>
+            <w:r>
+              <w:t xml:space="preserve">207</w:t>
+            </w:r>
+          </w:p>
+        </w:tc>
+        <w:tc>
+          <w:p>
+            <w:r>
+              <w:t xml:space="preserve">1</w:t>
+            </w:r>
+          </w:p>
+        </w:tc>
+      </w:tr>
+      <w:tr>
+        <w:tc>
+          <w:p>
+            <w:r>
+              <w:t xml:space="preserve">Week 31</w:t>
+            </w:r>
+          </w:p>
+        </w:tc>
+        <w:tc>
+          <w:p>
+            <w:r>
+              <w:t xml:space="preserve">210</w:t>
+            </w:r>
+          </w:p>
+        </w:tc>
+        <w:tc>
+          <w:p>
+            <w:r>
+              <w:t xml:space="preserve">2</w:t>
+            </w:r>
+          </w:p>
+        </w:tc>
+      </w:tr>
+      <w:tr>
+        <w:tc>
+          <w:p>
+            <w:r>
+              <w:t xml:space="preserve">Week 32</w:t>
+            </w:r>
+          </w:p>
+        </w:tc>
+        <w:tc>
+          <w:p>
+            <w:r>
+              <w:t xml:space="preserve">213</w:t>
+            </w:r>
+          </w:p>
+        </w:tc>
+        <w:tc>
+          <w:p>
+            <w:r>
+              <w:t xml:space="preserve">3</w:t>
+            </w:r>
+          </w:p>
+        </w:tc>
+      </w:tr>
+      <w:tr>
+        <w:tc>
+          <w:p>
+            <w:r>
+              <w:t xml:space="preserve">Week 33</w:t>
+            </w:r>
+          </w:p>
+        </w:tc>
+        <w:tc>
+          <w:p>
+            <w:r>
+              <w:t xml:space="preserve">216</w:t>
+            </w:r>
+          </w:p>
+        </w:tc>
+        <w:tc>
+          <w:p>
+            <w:r>
+              <w:t xml:space="preserve">4</w:t>
+            </w:r>
+          </w:p>
+        </w:tc>
+      </w:tr>
+      <w:tr>
+        <w:tc>
+          <w:p>
+            <w:r>
+              <w:t xml:space="preserve">Week 34</w:t>
+            </w:r>
+          </w:p>
+        </w:tc>
+        <w:tc>
+          <w:p>
+            <w:r>
+              <w:t xml:space="preserve">219</w:t>
+            </w:r>
+          </w:p>
+        </w:tc>
+        <w:tc>
+          <w:p>
+            <w:r>
+              <w:t xml:space="preserve">5</w:t>
+            </w:r>
+          </w:p>
+        </w:tc>
+      </w:tr>
+      <w:tr>
+        <w:tc>
+          <w:p>
+            <w:r>
+              <w:t xml:space="preserve">Week 35</w:t>
+            </w:r>
+          </w:p>
+        </w:tc>
+        <w:tc>
+          <w:p>
+            <w:r>
+              <w:t xml:space="preserve">222</w:t>
+            </w:r>
+          </w:p>
+        </w:tc>
+        <w:tc>
+          <w:p>
+            <w:r>
+              <w:t xml:space="preserve">6</w:t>
+            </w:r>
+          </w:p>
+        </w:tc>
+      </w:tr>
+      <w:tr>
+        <w:tc>
+          <w:p>
+            <w:r>
+              <w:t xml:space="preserve">Week 36</w:t>
+            </w:r>
+          </w:p>
+        </w:tc>
+        <w:tc>
+          <w:p>
+            <w:r>
+              <w:t xml:space="preserve">225</w:t>
+            </w:r>
+          </w:p>
+        </w:tc>
+        <w:tc>
+          <w:p>
+            <w:r>
+              <w:t xml:space="preserve">0</w:t>
+            </w:r>
+          </w:p>
+        </w:tc>
+      </w:tr>
+      <w:tr>
+        <w:tc>
+          <w:p>
+            <w:r>
+              <w:t xml:space="preserve">Week 37</w:t>
+            </w:r>
+          </w:p>
+        </w:tc>
+        <w:tc>
+          <w:p>
+            <w:r>
+              <w:t xml:space="preserve">228</w:t>
+            </w:r>
+          </w:p>
+        </w:tc>
+        <w:tc>
+          <w:p>
+            <w:r>
+              <w:t xml:space="preserve">1</w:t>
+            </w:r>
+          </w:p>
+        </w:tc>
+      </w:tr>
+      <w:tr>
+        <w:tc>
+          <w:p>
+            <w:r>
+              <w:t xml:space="preserve">Week 38</w:t>
+            </w:r>
+          </w:p>
+        </w:tc>
+        <w:tc>
+          <w:p>
+            <w:r>
+              <w:t xml:space="preserve">231</w:t>
+            </w:r>
+          </w:p>
+        </w:tc>
+        <w:tc>
+          <w:p>
+            <w:r>
+              <w:t xml:space="preserve">2</w:t>
+            </w:r>
+          </w:p>
+        </w:tc>
+      </w:tr>
+      <w:tr>
+        <w:tc>
+          <w:p>
+            <w:r>
+              <w:t xml:space="preserve">Week 39</w:t>
+            </w:r>
+          </w:p>
+        </w:tc>
+        <w:tc>
+          <w:p>
+            <w:r>
+              <w:t xml:space="preserve">234</w:t>
+            </w:r>
+          </w:p>
+        </w:tc>
+        <w:tc>
+          <w:p>
+            <w:r>
+              <w:t xml:space="preserve">3</w:t>
+            </w:r>
+          </w:p>
+        </w:tc>
+      </w:tr>
+      <w:tr>
+        <w:tc>
+          <w:p>
+            <w:r>
+              <w:t xml:space="preserve">Week 40</w:t>
+            </w:r>
+          </w:p>
+        </w:tc>
+        <w:tc>
+          <w:p>
+            <w:r>
+              <w:t xml:space="preserve">237</w:t>
+            </w:r>
+          </w:p>
+        </w:tc>
+        <w:tc>
+          <w:p>
+            <w:r>
+              <w:t xml:space="preserve">4</w:t>
+            </w:r>
+          </w:p>
+        </w:tc>
+      </w:tr>
+      <w:tr>
+        <w:tc>
+          <w:p>
+            <w:r>
+              <w:t xml:space="preserve">Week 41</w:t>
+            </w:r>
+          </w:p>
+        </w:tc>
+        <w:tc>
+          <w:p>
+            <w:r>
+              <w:t xml:space="preserve">240</w:t>
+            </w:r>
+          </w:p>
+        </w:tc>
+        <w:tc>
+          <w:p>
+            <w:r>
+              <w:t xml:space="preserve">5</w:t>
+            </w:r>
+          </w:p>
+        </w:tc>
+      </w:tr>
+      <w:tr>
+        <w:tc>
+          <w:p>
+            <w:r>
+              <w:t xml:space="preserve">Week 42</w:t>
+            </w:r>
+          </w:p>
+        </w:tc>
+        <w:tc>
+          <w:p>
+            <w:r>
+              <w:t xml:space="preserve">243</w:t>
+            </w:r>
+          </w:p>
+        </w:tc>
+        <w:tc>
+          <w:p>
+            <w:r>
+              <w:t xml:space="preserve">6</w:t>
+            </w:r>
+          </w:p>
+        </w:tc>
+      </w:tr>
+      <w:tr>
+        <w:tc>
+          <w:p>
+            <w:r>
+              <w:t xml:space="preserve">Week 43</w:t>
+            </w:r>
+          </w:p>
+        </w:tc>
+        <w:tc>
+          <w:p>
+            <w:r>
+              <w:t xml:space="preserve">246</w:t>
+            </w:r>
+          </w:p>
+        </w:tc>
+        <w:tc>
+          <w:p>
+            <w:r>
+              <w:t xml:space="preserve">0</w:t>
+            </w:r>
+          </w:p>
+        </w:tc>
+      </w:tr>
+      <w:tr>
+        <w:tc>
+          <w:p>
+            <w:r>
+              <w:t xml:space="preserve">Week 44</w:t>
+            </w:r>
+          </w:p>
+        </w:tc>
+        <w:tc>
+          <w:p>
+            <w:r>
+              <w:t xml:space="preserve">249</w:t>
+            </w:r>
+          </w:p>
+        </w:tc>
+        <w:tc>
+          <w:p>
+            <w:r>
+              <w:t xml:space="preserve">1</w:t>
+            </w:r>
+          </w:p>
+        </w:tc>
+      </w:tr>
+      <w:tr>
+        <w:tc>
+          <w:p>
+            <w:r>
+              <w:t xml:space="preserve">Week 45</w:t>
+            </w:r>
+          </w:p>
+        </w:tc>
+        <w:tc>
+          <w:p>
+            <w:r>
+              <w:t xml:space="preserve">252</w:t>
+            </w:r>
+          </w:p>
+        </w:tc>
+        <w:tc>
+          <w:p>
+            <w:r>
+              <w:t xml:space="preserve">2</w:t>
+            </w:r>
+          </w:p>
+        </w:tc>
+      </w:tr>
+      <w:tr>
+        <w:tc>
+          <w:p>
+            <w:r>
+              <w:t xml:space="preserve">Week 46</w:t>
+            </w:r>
+          </w:p>
+        </w:tc>
+        <w:tc>
+          <w:p>
+            <w:r>
+              <w:t xml:space="preserve">255</w:t>
+            </w:r>
+          </w:p>
+        </w:tc>
+        <w:tc>
+          <w:p>
+            <w:r>
+              <w:t xml:space="preserve">3</w:t>
+            </w:r>
+          </w:p>
+        </w:tc>
+      </w:tr>
+      <w:tr>
+        <w:tc>
+          <w:p>
+            <w:r>
+              <w:t xml:space="preserve">Week 47</w:t>
+            </w:r>
+          </w:p>
+        </w:tc>
+        <w:tc>
+          <w:p>
+            <w:r>
+              <w:t xml:space="preserve">258</w:t>
+            </w:r>
+          </w:p>
+        </w:tc>
+        <w:tc>
+          <w:p>
+            <w:r>
+              <w:t xml:space="preserve">4</w:t>
+            </w:r>
+          </w:p>
+        </w:tc>
+      </w:tr>
+      <w:tr>
+        <w:tc>
+          <w:p>
+            <w:r>
+              <w:t xml:space="preserve">Week 48</w:t>
+            </w:r>
+          </w:p>
+        </w:tc>
+        <w:tc>
+          <w:p>
+            <w:r>
+              <w:t xml:space="preserve">261</w:t>
+            </w:r>
+          </w:p>
+        </w:tc>
+        <w:tc>
+          <w:p>
+            <w:r>
+              <w:t xml:space="preserve">5</w:t>
+            </w:r>
+          </w:p>
+        </w:tc>
+      </w:tr>
+      <w:tr>
+        <w:tc>
+          <w:p>
+            <w:r>
+              <w:t xml:space="preserve">Week 49</w:t>
+            </w:r>
+          </w:p>
+        </w:tc>
+        <w:tc>
+          <w:p>
+            <w:r>
+              <w:t xml:space="preserve">264</w:t>
+            </w:r>
+          </w:p>
+        </w:tc>
+        <w:tc>
+          <w:p>
+            <w:r>
+              <w:t xml:space="preserve">6</w:t>
+            </w:r>
+          </w:p>
+        </w:tc>
+      </w:tr>
+      <w:tr>
+        <w:tc>
+          <w:p>
+            <w:r>
+              <w:t xml:space="preserve">Week 50</w:t>
+            </w:r>
+          </w:p>
+        </w:tc>
+        <w:tc>
+          <w:p>
+            <w:r>
+              <w:t xml:space="preserve">267</w:t>
+            </w:r>
+          </w:p>
+        </w:tc>
+        <w:tc>
+          <w:p>
+            <w:r>
+              <w:t xml:space="preserve">0</w:t>
+            </w:r>
+          </w:p>
+        </w:tc>
+      </w:tr>
+      <w:tr>
+        <w:tc>
+          <w:p>
+            <w:r>
+              <w:t xml:space="preserve">Week 51</w:t>
+            </w:r>
+          </w:p>
+        </w:tc>
+        <w:tc>
+          <w:p>
+            <w:r>
+              <w:t xml:space="preserve">270</w:t>
+            </w:r>
+          </w:p>
+        </w:tc>
+        <w:tc>
+          <w:p>
+            <w:r>
+              <w:t xml:space="preserve">1</w:t>
+            </w:r>
+          </w:p>
+        </w:tc>
+      </w:tr>
+      <w:tr>
+        <w:tc>
+          <w:p>
+            <w:r>
+              <w:t xml:space="preserve">Week 52</w:t>
+            </w:r>
+          </w:p>
+        </w:tc>
+        <w:tc>
+          <w:p>
+            <w:r>
+              <w:t xml:space="preserve">273</w:t>
+            </w:r>
+          </w:p>
+        </w:tc>
+        <w:tc>
+          <w:p>
+            <w:r>
+              <w:t xml:space="preserve">2</w:t>
+            </w:r>
+          </w:p>
+        </w:tc>
+      </w:tr>
+      <w:tr>
+        <w:tc>
+          <w:p>
+            <w:r>
+              <w:t xml:space="preserve">Week 53</w:t>
+            </w:r>
+          </w:p>
+        </w:tc>
+        <w:tc>
+          <w:p>
+            <w:r>
+              <w:t xml:space="preserve">276</w:t>
+            </w:r>
+          </w:p>
+        </w:tc>
+        <w:tc>
+          <w:p>
+            <w:r>
+              <w:t xml:space="preserve">3</w:t>
+            </w:r>
+          </w:p>
+        </w:tc>
+      </w:tr>
+      <w:tr>
+        <w:tc>
+          <w:p>
+            <w:r>
+              <w:t xml:space="preserve">Week 54</w:t>
+            </w:r>
+          </w:p>
+        </w:tc>
+        <w:tc>
+          <w:p>
+            <w:r>
+              <w:t xml:space="preserve">279</w:t>
+            </w:r>
+          </w:p>
+        </w:tc>
+        <w:tc>
+          <w:p>
+            <w:r>
+              <w:t xml:space="preserve">4</w:t>
+            </w:r>
+          </w:p>
+        </w:tc>
+      </w:tr>
+      <w:tr>
+        <w:tc>
+          <w:p>
+            <w:r>
+              <w:t xml:space="preserve">Week 55</w:t>
+            </w:r>
+          </w:p>
+        </w:tc>
+        <w:tc>
+          <w:p>
+            <w:r>
+              <w:t xml:space="preserve">282</w:t>
+            </w:r>
+          </w:p>
+        </w:tc>
+        <w:tc>
+          <w:p>
+            <w:r>
+              <w:t xml:space="preserve">5</w:t>
+            </w:r>
+          </w:p>
+        </w:tc>
+      </w:tr>
+      <w:tr>
+        <w:tc>
+          <w:p>
+            <w:r>
+              <w:t xml:space="preserve">Week 56</w:t>
+            </w:r>
+          </w:p>
+        </w:tc>
+        <w:tc>
+          <w:p>
+            <w:r>
+              <w:t xml:space="preserve">285</w:t>
+            </w:r>
+          </w:p>
+        </w:tc>
+        <w:tc>
+          <w:p>
+            <w:r>
+              <w:t xml:space="preserve">6</w:t>
+            </w:r>
+          </w:p>
+        </w:tc>
+      </w:tr>
+      <w:tr>
+        <w:tc>
+          <w:p>
+            <w:r>
+              <w:t xml:space="preserve">Week 57</w:t>
+            </w:r>
+          </w:p>
+        </w:tc>
+        <w:tc>
+          <w:p>
+            <w:r>
+              <w:t xml:space="preserve">288</w:t>
+            </w:r>
+          </w:p>
+        </w:tc>
+        <w:tc>
+          <w:p>
+            <w:r>
+              <w:t xml:space="preserve">0</w:t>
+            </w:r>
+          </w:p>
+        </w:tc>
+      </w:tr>
+      <w:tr>
+        <w:tc>
+          <w:p>
+            <w:r>
+              <w:t xml:space="preserve">Week 58</w:t>
+            </w:r>
+          </w:p>
+        </w:tc>
+        <w:tc>
+          <w:p>
+            <w:r>
+              <w:t xml:space="preserve">291</w:t>
+            </w:r>
+          </w:p>
+        </w:tc>
+        <w:tc>
+          <w:p>
+            <w:r>
+              <w:t xml:space="preserve">1</w:t>
+            </w:r>
+          </w:p>
+        </w:tc>
+      </w:tr>
+      <w:tr>
+        <w:tc>
+          <w:p>
+            <w:r>
+              <w:t xml:space="preserve">Week 59</w:t>
+            </w:r>
+          </w:p>
+        </w:tc>
+        <w:tc>
+          <w:p>
+            <w:r>
+              <w:t xml:space="preserve">294</w:t>
+            </w:r>
+          </w:p>
+        </w:tc>
+        <w:tc>
+          <w:p>
+            <w:r>
+              <w:t xml:space="preserve">2</w:t>
+            </w:r>
+          </w:p>
+        </w:tc>
+      </w:tr>
+      <w:tr>
+        <w:tc>
+          <w:p>
+            <w:r>
+              <w:t xml:space="preserve">Week 60</w:t>
+            </w:r>
+          </w:p>
+        </w:tc>
+        <w:tc>
+          <w:p>
+            <w:r>
+              <w:t xml:space="preserve">297</w:t>
+            </w:r>
+          </w:p>
+        </w:tc>
+        <w:tc>
+          <w:p>
+            <w:r>
+              <w:t xml:space="preserve">3</w:t>
+            </w:r>
+          </w:p>
+        </w:tc>
+      </w:tr>
+    </w:tbl>
     <w:p>
       <w:pPr>
         <w:pStyle w:val="Heading1"/>

</xml_diff>

<commit_message>
feat: split Word documents that were never paginated into pages (#16)
Pages much taller than their paper size, from documents Word never laid out, are split between blocks and table rows after rendering. Each page repeats the running header and footer; pages that only overflow a little are left alone.
</commit_message>
<xml_diff>
--- a/test/fixtures/long.docx
+++ b/test/fixtures/long.docx
@@ -470,6 +470,1454 @@
         <w:t xml:space="preserve">In stable assumptions across across and detailed expanded risks markets assumptions assumptions customer team times improved remained. Along growth expanded detailed quarterly follow growth revenue the new expanded with and and. Along follow team regions detailed costs to quarterly customer costs. The the expanded team support along the next growth response. Outlines remained expanded with appendix quarterly detailed expanded along across across.</w:t>
       </w:r>
     </w:p>
+    <w:tbl>
+      <w:tblPr>
+        <w:tblW w:type="pct" w:w="5000"/>
+        <w:tblBorders>
+          <w:top w:val="single" w:color="auto" w:sz="4"/>
+          <w:left w:val="single" w:color="auto" w:sz="4"/>
+          <w:bottom w:val="single" w:color="auto" w:sz="4"/>
+          <w:right w:val="single" w:color="auto" w:sz="4"/>
+          <w:insideH w:val="single" w:color="auto" w:sz="4"/>
+          <w:insideV w:val="single" w:color="auto" w:sz="4"/>
+        </w:tblBorders>
+      </w:tblPr>
+      <w:tblGrid>
+        <w:gridCol w:w="3009"/>
+        <w:gridCol w:w="3009"/>
+        <w:gridCol w:w="3009"/>
+      </w:tblGrid>
+      <w:tr>
+        <w:trPr>
+          <w:tblHeader/>
+        </w:trPr>
+        <w:tc>
+          <w:tcPr>
+            <w:shd w:fill="1F4E79" w:color="auto" w:val="clear"/>
+          </w:tcPr>
+          <w:p>
+            <w:r>
+              <w:rPr>
+                <w:b/>
+                <w:bCs/>
+                <w:color w:val="FFFFFF"/>
+              </w:rPr>
+              <w:t xml:space="preserve">Week</w:t>
+            </w:r>
+          </w:p>
+        </w:tc>
+        <w:tc>
+          <w:tcPr>
+            <w:shd w:fill="1F4E79" w:color="auto" w:val="clear"/>
+          </w:tcPr>
+          <w:p>
+            <w:r>
+              <w:rPr>
+                <w:b/>
+                <w:bCs/>
+                <w:color w:val="FFFFFF"/>
+              </w:rPr>
+              <w:t xml:space="preserve">Orders</w:t>
+            </w:r>
+          </w:p>
+        </w:tc>
+        <w:tc>
+          <w:tcPr>
+            <w:shd w:fill="1F4E79" w:color="auto" w:val="clear"/>
+          </w:tcPr>
+          <w:p>
+            <w:r>
+              <w:rPr>
+                <w:b/>
+                <w:bCs/>
+                <w:color w:val="FFFFFF"/>
+              </w:rPr>
+              <w:t xml:space="preserve">Returns</w:t>
+            </w:r>
+          </w:p>
+        </w:tc>
+      </w:tr>
+      <w:tr>
+        <w:tc>
+          <w:p>
+            <w:r>
+              <w:t xml:space="preserve">Week 1</w:t>
+            </w:r>
+          </w:p>
+        </w:tc>
+        <w:tc>
+          <w:p>
+            <w:r>
+              <w:t xml:space="preserve">120</w:t>
+            </w:r>
+          </w:p>
+        </w:tc>
+        <w:tc>
+          <w:p>
+            <w:r>
+              <w:t xml:space="preserve">0</w:t>
+            </w:r>
+          </w:p>
+        </w:tc>
+      </w:tr>
+      <w:tr>
+        <w:tc>
+          <w:p>
+            <w:r>
+              <w:t xml:space="preserve">Week 2</w:t>
+            </w:r>
+          </w:p>
+        </w:tc>
+        <w:tc>
+          <w:p>
+            <w:r>
+              <w:t xml:space="preserve">123</w:t>
+            </w:r>
+          </w:p>
+        </w:tc>
+        <w:tc>
+          <w:p>
+            <w:r>
+              <w:t xml:space="preserve">1</w:t>
+            </w:r>
+          </w:p>
+        </w:tc>
+      </w:tr>
+      <w:tr>
+        <w:tc>
+          <w:p>
+            <w:r>
+              <w:t xml:space="preserve">Week 3</w:t>
+            </w:r>
+          </w:p>
+        </w:tc>
+        <w:tc>
+          <w:p>
+            <w:r>
+              <w:t xml:space="preserve">126</w:t>
+            </w:r>
+          </w:p>
+        </w:tc>
+        <w:tc>
+          <w:p>
+            <w:r>
+              <w:t xml:space="preserve">2</w:t>
+            </w:r>
+          </w:p>
+        </w:tc>
+      </w:tr>
+      <w:tr>
+        <w:tc>
+          <w:p>
+            <w:r>
+              <w:t xml:space="preserve">Week 4</w:t>
+            </w:r>
+          </w:p>
+        </w:tc>
+        <w:tc>
+          <w:p>
+            <w:r>
+              <w:t xml:space="preserve">129</w:t>
+            </w:r>
+          </w:p>
+        </w:tc>
+        <w:tc>
+          <w:p>
+            <w:r>
+              <w:t xml:space="preserve">3</w:t>
+            </w:r>
+          </w:p>
+        </w:tc>
+      </w:tr>
+      <w:tr>
+        <w:tc>
+          <w:p>
+            <w:r>
+              <w:t xml:space="preserve">Week 5</w:t>
+            </w:r>
+          </w:p>
+        </w:tc>
+        <w:tc>
+          <w:p>
+            <w:r>
+              <w:t xml:space="preserve">132</w:t>
+            </w:r>
+          </w:p>
+        </w:tc>
+        <w:tc>
+          <w:p>
+            <w:r>
+              <w:t xml:space="preserve">4</w:t>
+            </w:r>
+          </w:p>
+        </w:tc>
+      </w:tr>
+      <w:tr>
+        <w:tc>
+          <w:p>
+            <w:r>
+              <w:t xml:space="preserve">Week 6</w:t>
+            </w:r>
+          </w:p>
+        </w:tc>
+        <w:tc>
+          <w:p>
+            <w:r>
+              <w:t xml:space="preserve">135</w:t>
+            </w:r>
+          </w:p>
+        </w:tc>
+        <w:tc>
+          <w:p>
+            <w:r>
+              <w:t xml:space="preserve">5</w:t>
+            </w:r>
+          </w:p>
+        </w:tc>
+      </w:tr>
+      <w:tr>
+        <w:tc>
+          <w:p>
+            <w:r>
+              <w:t xml:space="preserve">Week 7</w:t>
+            </w:r>
+          </w:p>
+        </w:tc>
+        <w:tc>
+          <w:p>
+            <w:r>
+              <w:t xml:space="preserve">138</w:t>
+            </w:r>
+          </w:p>
+        </w:tc>
+        <w:tc>
+          <w:p>
+            <w:r>
+              <w:t xml:space="preserve">6</w:t>
+            </w:r>
+          </w:p>
+        </w:tc>
+      </w:tr>
+      <w:tr>
+        <w:tc>
+          <w:p>
+            <w:r>
+              <w:t xml:space="preserve">Week 8</w:t>
+            </w:r>
+          </w:p>
+        </w:tc>
+        <w:tc>
+          <w:p>
+            <w:r>
+              <w:t xml:space="preserve">141</w:t>
+            </w:r>
+          </w:p>
+        </w:tc>
+        <w:tc>
+          <w:p>
+            <w:r>
+              <w:t xml:space="preserve">0</w:t>
+            </w:r>
+          </w:p>
+        </w:tc>
+      </w:tr>
+      <w:tr>
+        <w:tc>
+          <w:p>
+            <w:r>
+              <w:t xml:space="preserve">Week 9</w:t>
+            </w:r>
+          </w:p>
+        </w:tc>
+        <w:tc>
+          <w:p>
+            <w:r>
+              <w:t xml:space="preserve">144</w:t>
+            </w:r>
+          </w:p>
+        </w:tc>
+        <w:tc>
+          <w:p>
+            <w:r>
+              <w:t xml:space="preserve">1</w:t>
+            </w:r>
+          </w:p>
+        </w:tc>
+      </w:tr>
+      <w:tr>
+        <w:tc>
+          <w:p>
+            <w:r>
+              <w:t xml:space="preserve">Week 10</w:t>
+            </w:r>
+          </w:p>
+        </w:tc>
+        <w:tc>
+          <w:p>
+            <w:r>
+              <w:t xml:space="preserve">147</w:t>
+            </w:r>
+          </w:p>
+        </w:tc>
+        <w:tc>
+          <w:p>
+            <w:r>
+              <w:t xml:space="preserve">2</w:t>
+            </w:r>
+          </w:p>
+        </w:tc>
+      </w:tr>
+      <w:tr>
+        <w:tc>
+          <w:p>
+            <w:r>
+              <w:t xml:space="preserve">Week 11</w:t>
+            </w:r>
+          </w:p>
+        </w:tc>
+        <w:tc>
+          <w:p>
+            <w:r>
+              <w:t xml:space="preserve">150</w:t>
+            </w:r>
+          </w:p>
+        </w:tc>
+        <w:tc>
+          <w:p>
+            <w:r>
+              <w:t xml:space="preserve">3</w:t>
+            </w:r>
+          </w:p>
+        </w:tc>
+      </w:tr>
+      <w:tr>
+        <w:tc>
+          <w:p>
+            <w:r>
+              <w:t xml:space="preserve">Week 12</w:t>
+            </w:r>
+          </w:p>
+        </w:tc>
+        <w:tc>
+          <w:p>
+            <w:r>
+              <w:t xml:space="preserve">153</w:t>
+            </w:r>
+          </w:p>
+        </w:tc>
+        <w:tc>
+          <w:p>
+            <w:r>
+              <w:t xml:space="preserve">4</w:t>
+            </w:r>
+          </w:p>
+        </w:tc>
+      </w:tr>
+      <w:tr>
+        <w:tc>
+          <w:p>
+            <w:r>
+              <w:t xml:space="preserve">Week 13</w:t>
+            </w:r>
+          </w:p>
+        </w:tc>
+        <w:tc>
+          <w:p>
+            <w:r>
+              <w:t xml:space="preserve">156</w:t>
+            </w:r>
+          </w:p>
+        </w:tc>
+        <w:tc>
+          <w:p>
+            <w:r>
+              <w:t xml:space="preserve">5</w:t>
+            </w:r>
+          </w:p>
+        </w:tc>
+      </w:tr>
+      <w:tr>
+        <w:tc>
+          <w:p>
+            <w:r>
+              <w:t xml:space="preserve">Week 14</w:t>
+            </w:r>
+          </w:p>
+        </w:tc>
+        <w:tc>
+          <w:p>
+            <w:r>
+              <w:t xml:space="preserve">159</w:t>
+            </w:r>
+          </w:p>
+        </w:tc>
+        <w:tc>
+          <w:p>
+            <w:r>
+              <w:t xml:space="preserve">6</w:t>
+            </w:r>
+          </w:p>
+        </w:tc>
+      </w:tr>
+      <w:tr>
+        <w:tc>
+          <w:p>
+            <w:r>
+              <w:t xml:space="preserve">Week 15</w:t>
+            </w:r>
+          </w:p>
+        </w:tc>
+        <w:tc>
+          <w:p>
+            <w:r>
+              <w:t xml:space="preserve">162</w:t>
+            </w:r>
+          </w:p>
+        </w:tc>
+        <w:tc>
+          <w:p>
+            <w:r>
+              <w:t xml:space="preserve">0</w:t>
+            </w:r>
+          </w:p>
+        </w:tc>
+      </w:tr>
+      <w:tr>
+        <w:tc>
+          <w:p>
+            <w:r>
+              <w:t xml:space="preserve">Week 16</w:t>
+            </w:r>
+          </w:p>
+        </w:tc>
+        <w:tc>
+          <w:p>
+            <w:r>
+              <w:t xml:space="preserve">165</w:t>
+            </w:r>
+          </w:p>
+        </w:tc>
+        <w:tc>
+          <w:p>
+            <w:r>
+              <w:t xml:space="preserve">1</w:t>
+            </w:r>
+          </w:p>
+        </w:tc>
+      </w:tr>
+      <w:tr>
+        <w:tc>
+          <w:p>
+            <w:r>
+              <w:t xml:space="preserve">Week 17</w:t>
+            </w:r>
+          </w:p>
+        </w:tc>
+        <w:tc>
+          <w:p>
+            <w:r>
+              <w:t xml:space="preserve">168</w:t>
+            </w:r>
+          </w:p>
+        </w:tc>
+        <w:tc>
+          <w:p>
+            <w:r>
+              <w:t xml:space="preserve">2</w:t>
+            </w:r>
+          </w:p>
+        </w:tc>
+      </w:tr>
+      <w:tr>
+        <w:tc>
+          <w:p>
+            <w:r>
+              <w:t xml:space="preserve">Week 18</w:t>
+            </w:r>
+          </w:p>
+        </w:tc>
+        <w:tc>
+          <w:p>
+            <w:r>
+              <w:t xml:space="preserve">171</w:t>
+            </w:r>
+          </w:p>
+        </w:tc>
+        <w:tc>
+          <w:p>
+            <w:r>
+              <w:t xml:space="preserve">3</w:t>
+            </w:r>
+          </w:p>
+        </w:tc>
+      </w:tr>
+      <w:tr>
+        <w:tc>
+          <w:p>
+            <w:r>
+              <w:t xml:space="preserve">Week 19</w:t>
+            </w:r>
+          </w:p>
+        </w:tc>
+        <w:tc>
+          <w:p>
+            <w:r>
+              <w:t xml:space="preserve">174</w:t>
+            </w:r>
+          </w:p>
+        </w:tc>
+        <w:tc>
+          <w:p>
+            <w:r>
+              <w:t xml:space="preserve">4</w:t>
+            </w:r>
+          </w:p>
+        </w:tc>
+      </w:tr>
+      <w:tr>
+        <w:tc>
+          <w:p>
+            <w:r>
+              <w:t xml:space="preserve">Week 20</w:t>
+            </w:r>
+          </w:p>
+        </w:tc>
+        <w:tc>
+          <w:p>
+            <w:r>
+              <w:t xml:space="preserve">177</w:t>
+            </w:r>
+          </w:p>
+        </w:tc>
+        <w:tc>
+          <w:p>
+            <w:r>
+              <w:t xml:space="preserve">5</w:t>
+            </w:r>
+          </w:p>
+        </w:tc>
+      </w:tr>
+      <w:tr>
+        <w:tc>
+          <w:p>
+            <w:r>
+              <w:t xml:space="preserve">Week 21</w:t>
+            </w:r>
+          </w:p>
+        </w:tc>
+        <w:tc>
+          <w:p>
+            <w:r>
+              <w:t xml:space="preserve">180</w:t>
+            </w:r>
+          </w:p>
+        </w:tc>
+        <w:tc>
+          <w:p>
+            <w:r>
+              <w:t xml:space="preserve">6</w:t>
+            </w:r>
+          </w:p>
+        </w:tc>
+      </w:tr>
+      <w:tr>
+        <w:tc>
+          <w:p>
+            <w:r>
+              <w:t xml:space="preserve">Week 22</w:t>
+            </w:r>
+          </w:p>
+        </w:tc>
+        <w:tc>
+          <w:p>
+            <w:r>
+              <w:t xml:space="preserve">183</w:t>
+            </w:r>
+          </w:p>
+        </w:tc>
+        <w:tc>
+          <w:p>
+            <w:r>
+              <w:t xml:space="preserve">0</w:t>
+            </w:r>
+          </w:p>
+        </w:tc>
+      </w:tr>
+      <w:tr>
+        <w:tc>
+          <w:p>
+            <w:r>
+              <w:t xml:space="preserve">Week 23</w:t>
+            </w:r>
+          </w:p>
+        </w:tc>
+        <w:tc>
+          <w:p>
+            <w:r>
+              <w:t xml:space="preserve">186</w:t>
+            </w:r>
+          </w:p>
+        </w:tc>
+        <w:tc>
+          <w:p>
+            <w:r>
+              <w:t xml:space="preserve">1</w:t>
+            </w:r>
+          </w:p>
+        </w:tc>
+      </w:tr>
+      <w:tr>
+        <w:tc>
+          <w:p>
+            <w:r>
+              <w:t xml:space="preserve">Week 24</w:t>
+            </w:r>
+          </w:p>
+        </w:tc>
+        <w:tc>
+          <w:p>
+            <w:r>
+              <w:t xml:space="preserve">189</w:t>
+            </w:r>
+          </w:p>
+        </w:tc>
+        <w:tc>
+          <w:p>
+            <w:r>
+              <w:t xml:space="preserve">2</w:t>
+            </w:r>
+          </w:p>
+        </w:tc>
+      </w:tr>
+      <w:tr>
+        <w:tc>
+          <w:p>
+            <w:r>
+              <w:t xml:space="preserve">Week 25</w:t>
+            </w:r>
+          </w:p>
+        </w:tc>
+        <w:tc>
+          <w:p>
+            <w:r>
+              <w:t xml:space="preserve">192</w:t>
+            </w:r>
+          </w:p>
+        </w:tc>
+        <w:tc>
+          <w:p>
+            <w:r>
+              <w:t xml:space="preserve">3</w:t>
+            </w:r>
+          </w:p>
+        </w:tc>
+      </w:tr>
+      <w:tr>
+        <w:tc>
+          <w:p>
+            <w:r>
+              <w:t xml:space="preserve">Week 26</w:t>
+            </w:r>
+          </w:p>
+        </w:tc>
+        <w:tc>
+          <w:p>
+            <w:r>
+              <w:t xml:space="preserve">195</w:t>
+            </w:r>
+          </w:p>
+        </w:tc>
+        <w:tc>
+          <w:p>
+            <w:r>
+              <w:t xml:space="preserve">4</w:t>
+            </w:r>
+          </w:p>
+        </w:tc>
+      </w:tr>
+      <w:tr>
+        <w:tc>
+          <w:p>
+            <w:r>
+              <w:t xml:space="preserve">Week 27</w:t>
+            </w:r>
+          </w:p>
+        </w:tc>
+        <w:tc>
+          <w:p>
+            <w:r>
+              <w:t xml:space="preserve">198</w:t>
+            </w:r>
+          </w:p>
+        </w:tc>
+        <w:tc>
+          <w:p>
+            <w:r>
+              <w:t xml:space="preserve">5</w:t>
+            </w:r>
+          </w:p>
+        </w:tc>
+      </w:tr>
+      <w:tr>
+        <w:tc>
+          <w:p>
+            <w:r>
+              <w:t xml:space="preserve">Week 28</w:t>
+            </w:r>
+          </w:p>
+        </w:tc>
+        <w:tc>
+          <w:p>
+            <w:r>
+              <w:t xml:space="preserve">201</w:t>
+            </w:r>
+          </w:p>
+        </w:tc>
+        <w:tc>
+          <w:p>
+            <w:r>
+              <w:t xml:space="preserve">6</w:t>
+            </w:r>
+          </w:p>
+        </w:tc>
+      </w:tr>
+      <w:tr>
+        <w:tc>
+          <w:p>
+            <w:r>
+              <w:t xml:space="preserve">Week 29</w:t>
+            </w:r>
+          </w:p>
+        </w:tc>
+        <w:tc>
+          <w:p>
+            <w:r>
+              <w:t xml:space="preserve">204</w:t>
+            </w:r>
+          </w:p>
+        </w:tc>
+        <w:tc>
+          <w:p>
+            <w:r>
+              <w:t xml:space="preserve">0</w:t>
+            </w:r>
+          </w:p>
+        </w:tc>
+      </w:tr>
+      <w:tr>
+        <w:tc>
+          <w:p>
+            <w:r>
+              <w:t xml:space="preserve">Week 30</w:t>
+            </w:r>
+          </w:p>
+        </w:tc>
+        <w:tc>
+          <w:p>
+            <w:r>
+              <w:t xml:space="preserve">207</w:t>
+            </w:r>
+          </w:p>
+        </w:tc>
+        <w:tc>
+          <w:p>
+            <w:r>
+              <w:t xml:space="preserve">1</w:t>
+            </w:r>
+          </w:p>
+        </w:tc>
+      </w:tr>
+      <w:tr>
+        <w:tc>
+          <w:p>
+            <w:r>
+              <w:t xml:space="preserve">Week 31</w:t>
+            </w:r>
+          </w:p>
+        </w:tc>
+        <w:tc>
+          <w:p>
+            <w:r>
+              <w:t xml:space="preserve">210</w:t>
+            </w:r>
+          </w:p>
+        </w:tc>
+        <w:tc>
+          <w:p>
+            <w:r>
+              <w:t xml:space="preserve">2</w:t>
+            </w:r>
+          </w:p>
+        </w:tc>
+      </w:tr>
+      <w:tr>
+        <w:tc>
+          <w:p>
+            <w:r>
+              <w:t xml:space="preserve">Week 32</w:t>
+            </w:r>
+          </w:p>
+        </w:tc>
+        <w:tc>
+          <w:p>
+            <w:r>
+              <w:t xml:space="preserve">213</w:t>
+            </w:r>
+          </w:p>
+        </w:tc>
+        <w:tc>
+          <w:p>
+            <w:r>
+              <w:t xml:space="preserve">3</w:t>
+            </w:r>
+          </w:p>
+        </w:tc>
+      </w:tr>
+      <w:tr>
+        <w:tc>
+          <w:p>
+            <w:r>
+              <w:t xml:space="preserve">Week 33</w:t>
+            </w:r>
+          </w:p>
+        </w:tc>
+        <w:tc>
+          <w:p>
+            <w:r>
+              <w:t xml:space="preserve">216</w:t>
+            </w:r>
+          </w:p>
+        </w:tc>
+        <w:tc>
+          <w:p>
+            <w:r>
+              <w:t xml:space="preserve">4</w:t>
+            </w:r>
+          </w:p>
+        </w:tc>
+      </w:tr>
+      <w:tr>
+        <w:tc>
+          <w:p>
+            <w:r>
+              <w:t xml:space="preserve">Week 34</w:t>
+            </w:r>
+          </w:p>
+        </w:tc>
+        <w:tc>
+          <w:p>
+            <w:r>
+              <w:t xml:space="preserve">219</w:t>
+            </w:r>
+          </w:p>
+        </w:tc>
+        <w:tc>
+          <w:p>
+            <w:r>
+              <w:t xml:space="preserve">5</w:t>
+            </w:r>
+          </w:p>
+        </w:tc>
+      </w:tr>
+      <w:tr>
+        <w:tc>
+          <w:p>
+            <w:r>
+              <w:t xml:space="preserve">Week 35</w:t>
+            </w:r>
+          </w:p>
+        </w:tc>
+        <w:tc>
+          <w:p>
+            <w:r>
+              <w:t xml:space="preserve">222</w:t>
+            </w:r>
+          </w:p>
+        </w:tc>
+        <w:tc>
+          <w:p>
+            <w:r>
+              <w:t xml:space="preserve">6</w:t>
+            </w:r>
+          </w:p>
+        </w:tc>
+      </w:tr>
+      <w:tr>
+        <w:tc>
+          <w:p>
+            <w:r>
+              <w:t xml:space="preserve">Week 36</w:t>
+            </w:r>
+          </w:p>
+        </w:tc>
+        <w:tc>
+          <w:p>
+            <w:r>
+              <w:t xml:space="preserve">225</w:t>
+            </w:r>
+          </w:p>
+        </w:tc>
+        <w:tc>
+          <w:p>
+            <w:r>
+              <w:t xml:space="preserve">0</w:t>
+            </w:r>
+          </w:p>
+        </w:tc>
+      </w:tr>
+      <w:tr>
+        <w:tc>
+          <w:p>
+            <w:r>
+              <w:t xml:space="preserve">Week 37</w:t>
+            </w:r>
+          </w:p>
+        </w:tc>
+        <w:tc>
+          <w:p>
+            <w:r>
+              <w:t xml:space="preserve">228</w:t>
+            </w:r>
+          </w:p>
+        </w:tc>
+        <w:tc>
+          <w:p>
+            <w:r>
+              <w:t xml:space="preserve">1</w:t>
+            </w:r>
+          </w:p>
+        </w:tc>
+      </w:tr>
+      <w:tr>
+        <w:tc>
+          <w:p>
+            <w:r>
+              <w:t xml:space="preserve">Week 38</w:t>
+            </w:r>
+          </w:p>
+        </w:tc>
+        <w:tc>
+          <w:p>
+            <w:r>
+              <w:t xml:space="preserve">231</w:t>
+            </w:r>
+          </w:p>
+        </w:tc>
+        <w:tc>
+          <w:p>
+            <w:r>
+              <w:t xml:space="preserve">2</w:t>
+            </w:r>
+          </w:p>
+        </w:tc>
+      </w:tr>
+      <w:tr>
+        <w:tc>
+          <w:p>
+            <w:r>
+              <w:t xml:space="preserve">Week 39</w:t>
+            </w:r>
+          </w:p>
+        </w:tc>
+        <w:tc>
+          <w:p>
+            <w:r>
+              <w:t xml:space="preserve">234</w:t>
+            </w:r>
+          </w:p>
+        </w:tc>
+        <w:tc>
+          <w:p>
+            <w:r>
+              <w:t xml:space="preserve">3</w:t>
+            </w:r>
+          </w:p>
+        </w:tc>
+      </w:tr>
+      <w:tr>
+        <w:tc>
+          <w:p>
+            <w:r>
+              <w:t xml:space="preserve">Week 40</w:t>
+            </w:r>
+          </w:p>
+        </w:tc>
+        <w:tc>
+          <w:p>
+            <w:r>
+              <w:t xml:space="preserve">237</w:t>
+            </w:r>
+          </w:p>
+        </w:tc>
+        <w:tc>
+          <w:p>
+            <w:r>
+              <w:t xml:space="preserve">4</w:t>
+            </w:r>
+          </w:p>
+        </w:tc>
+      </w:tr>
+      <w:tr>
+        <w:tc>
+          <w:p>
+            <w:r>
+              <w:t xml:space="preserve">Week 41</w:t>
+            </w:r>
+          </w:p>
+        </w:tc>
+        <w:tc>
+          <w:p>
+            <w:r>
+              <w:t xml:space="preserve">240</w:t>
+            </w:r>
+          </w:p>
+        </w:tc>
+        <w:tc>
+          <w:p>
+            <w:r>
+              <w:t xml:space="preserve">5</w:t>
+            </w:r>
+          </w:p>
+        </w:tc>
+      </w:tr>
+      <w:tr>
+        <w:tc>
+          <w:p>
+            <w:r>
+              <w:t xml:space="preserve">Week 42</w:t>
+            </w:r>
+          </w:p>
+        </w:tc>
+        <w:tc>
+          <w:p>
+            <w:r>
+              <w:t xml:space="preserve">243</w:t>
+            </w:r>
+          </w:p>
+        </w:tc>
+        <w:tc>
+          <w:p>
+            <w:r>
+              <w:t xml:space="preserve">6</w:t>
+            </w:r>
+          </w:p>
+        </w:tc>
+      </w:tr>
+      <w:tr>
+        <w:tc>
+          <w:p>
+            <w:r>
+              <w:t xml:space="preserve">Week 43</w:t>
+            </w:r>
+          </w:p>
+        </w:tc>
+        <w:tc>
+          <w:p>
+            <w:r>
+              <w:t xml:space="preserve">246</w:t>
+            </w:r>
+          </w:p>
+        </w:tc>
+        <w:tc>
+          <w:p>
+            <w:r>
+              <w:t xml:space="preserve">0</w:t>
+            </w:r>
+          </w:p>
+        </w:tc>
+      </w:tr>
+      <w:tr>
+        <w:tc>
+          <w:p>
+            <w:r>
+              <w:t xml:space="preserve">Week 44</w:t>
+            </w:r>
+          </w:p>
+        </w:tc>
+        <w:tc>
+          <w:p>
+            <w:r>
+              <w:t xml:space="preserve">249</w:t>
+            </w:r>
+          </w:p>
+        </w:tc>
+        <w:tc>
+          <w:p>
+            <w:r>
+              <w:t xml:space="preserve">1</w:t>
+            </w:r>
+          </w:p>
+        </w:tc>
+      </w:tr>
+      <w:tr>
+        <w:tc>
+          <w:p>
+            <w:r>
+              <w:t xml:space="preserve">Week 45</w:t>
+            </w:r>
+          </w:p>
+        </w:tc>
+        <w:tc>
+          <w:p>
+            <w:r>
+              <w:t xml:space="preserve">252</w:t>
+            </w:r>
+          </w:p>
+        </w:tc>
+        <w:tc>
+          <w:p>
+            <w:r>
+              <w:t xml:space="preserve">2</w:t>
+            </w:r>
+          </w:p>
+        </w:tc>
+      </w:tr>
+      <w:tr>
+        <w:tc>
+          <w:p>
+            <w:r>
+              <w:t xml:space="preserve">Week 46</w:t>
+            </w:r>
+          </w:p>
+        </w:tc>
+        <w:tc>
+          <w:p>
+            <w:r>
+              <w:t xml:space="preserve">255</w:t>
+            </w:r>
+          </w:p>
+        </w:tc>
+        <w:tc>
+          <w:p>
+            <w:r>
+              <w:t xml:space="preserve">3</w:t>
+            </w:r>
+          </w:p>
+        </w:tc>
+      </w:tr>
+      <w:tr>
+        <w:tc>
+          <w:p>
+            <w:r>
+              <w:t xml:space="preserve">Week 47</w:t>
+            </w:r>
+          </w:p>
+        </w:tc>
+        <w:tc>
+          <w:p>
+            <w:r>
+              <w:t xml:space="preserve">258</w:t>
+            </w:r>
+          </w:p>
+        </w:tc>
+        <w:tc>
+          <w:p>
+            <w:r>
+              <w:t xml:space="preserve">4</w:t>
+            </w:r>
+          </w:p>
+        </w:tc>
+      </w:tr>
+      <w:tr>
+        <w:tc>
+          <w:p>
+            <w:r>
+              <w:t xml:space="preserve">Week 48</w:t>
+            </w:r>
+          </w:p>
+        </w:tc>
+        <w:tc>
+          <w:p>
+            <w:r>
+              <w:t xml:space="preserve">261</w:t>
+            </w:r>
+          </w:p>
+        </w:tc>
+        <w:tc>
+          <w:p>
+            <w:r>
+              <w:t xml:space="preserve">5</w:t>
+            </w:r>
+          </w:p>
+        </w:tc>
+      </w:tr>
+      <w:tr>
+        <w:tc>
+          <w:p>
+            <w:r>
+              <w:t xml:space="preserve">Week 49</w:t>
+            </w:r>
+          </w:p>
+        </w:tc>
+        <w:tc>
+          <w:p>
+            <w:r>
+              <w:t xml:space="preserve">264</w:t>
+            </w:r>
+          </w:p>
+        </w:tc>
+        <w:tc>
+          <w:p>
+            <w:r>
+              <w:t xml:space="preserve">6</w:t>
+            </w:r>
+          </w:p>
+        </w:tc>
+      </w:tr>
+      <w:tr>
+        <w:tc>
+          <w:p>
+            <w:r>
+              <w:t xml:space="preserve">Week 50</w:t>
+            </w:r>
+          </w:p>
+        </w:tc>
+        <w:tc>
+          <w:p>
+            <w:r>
+              <w:t xml:space="preserve">267</w:t>
+            </w:r>
+          </w:p>
+        </w:tc>
+        <w:tc>
+          <w:p>
+            <w:r>
+              <w:t xml:space="preserve">0</w:t>
+            </w:r>
+          </w:p>
+        </w:tc>
+      </w:tr>
+      <w:tr>
+        <w:tc>
+          <w:p>
+            <w:r>
+              <w:t xml:space="preserve">Week 51</w:t>
+            </w:r>
+          </w:p>
+        </w:tc>
+        <w:tc>
+          <w:p>
+            <w:r>
+              <w:t xml:space="preserve">270</w:t>
+            </w:r>
+          </w:p>
+        </w:tc>
+        <w:tc>
+          <w:p>
+            <w:r>
+              <w:t xml:space="preserve">1</w:t>
+            </w:r>
+          </w:p>
+        </w:tc>
+      </w:tr>
+      <w:tr>
+        <w:tc>
+          <w:p>
+            <w:r>
+              <w:t xml:space="preserve">Week 52</w:t>
+            </w:r>
+          </w:p>
+        </w:tc>
+        <w:tc>
+          <w:p>
+            <w:r>
+              <w:t xml:space="preserve">273</w:t>
+            </w:r>
+          </w:p>
+        </w:tc>
+        <w:tc>
+          <w:p>
+            <w:r>
+              <w:t xml:space="preserve">2</w:t>
+            </w:r>
+          </w:p>
+        </w:tc>
+      </w:tr>
+      <w:tr>
+        <w:tc>
+          <w:p>
+            <w:r>
+              <w:t xml:space="preserve">Week 53</w:t>
+            </w:r>
+          </w:p>
+        </w:tc>
+        <w:tc>
+          <w:p>
+            <w:r>
+              <w:t xml:space="preserve">276</w:t>
+            </w:r>
+          </w:p>
+        </w:tc>
+        <w:tc>
+          <w:p>
+            <w:r>
+              <w:t xml:space="preserve">3</w:t>
+            </w:r>
+          </w:p>
+        </w:tc>
+      </w:tr>
+      <w:tr>
+        <w:tc>
+          <w:p>
+            <w:r>
+              <w:t xml:space="preserve">Week 54</w:t>
+            </w:r>
+          </w:p>
+        </w:tc>
+        <w:tc>
+          <w:p>
+            <w:r>
+              <w:t xml:space="preserve">279</w:t>
+            </w:r>
+          </w:p>
+        </w:tc>
+        <w:tc>
+          <w:p>
+            <w:r>
+              <w:t xml:space="preserve">4</w:t>
+            </w:r>
+          </w:p>
+        </w:tc>
+      </w:tr>
+      <w:tr>
+        <w:tc>
+          <w:p>
+            <w:r>
+              <w:t xml:space="preserve">Week 55</w:t>
+            </w:r>
+          </w:p>
+        </w:tc>
+        <w:tc>
+          <w:p>
+            <w:r>
+              <w:t xml:space="preserve">282</w:t>
+            </w:r>
+          </w:p>
+        </w:tc>
+        <w:tc>
+          <w:p>
+            <w:r>
+              <w:t xml:space="preserve">5</w:t>
+            </w:r>
+          </w:p>
+        </w:tc>
+      </w:tr>
+      <w:tr>
+        <w:tc>
+          <w:p>
+            <w:r>
+              <w:t xml:space="preserve">Week 56</w:t>
+            </w:r>
+          </w:p>
+        </w:tc>
+        <w:tc>
+          <w:p>
+            <w:r>
+              <w:t xml:space="preserve">285</w:t>
+            </w:r>
+          </w:p>
+        </w:tc>
+        <w:tc>
+          <w:p>
+            <w:r>
+              <w:t xml:space="preserve">6</w:t>
+            </w:r>
+          </w:p>
+        </w:tc>
+      </w:tr>
+      <w:tr>
+        <w:tc>
+          <w:p>
+            <w:r>
+              <w:t xml:space="preserve">Week 57</w:t>
+            </w:r>
+          </w:p>
+        </w:tc>
+        <w:tc>
+          <w:p>
+            <w:r>
+              <w:t xml:space="preserve">288</w:t>
+            </w:r>
+          </w:p>
+        </w:tc>
+        <w:tc>
+          <w:p>
+            <w:r>
+              <w:t xml:space="preserve">0</w:t>
+            </w:r>
+          </w:p>
+        </w:tc>
+      </w:tr>
+      <w:tr>
+        <w:tc>
+          <w:p>
+            <w:r>
+              <w:t xml:space="preserve">Week 58</w:t>
+            </w:r>
+          </w:p>
+        </w:tc>
+        <w:tc>
+          <w:p>
+            <w:r>
+              <w:t xml:space="preserve">291</w:t>
+            </w:r>
+          </w:p>
+        </w:tc>
+        <w:tc>
+          <w:p>
+            <w:r>
+              <w:t xml:space="preserve">1</w:t>
+            </w:r>
+          </w:p>
+        </w:tc>
+      </w:tr>
+      <w:tr>
+        <w:tc>
+          <w:p>
+            <w:r>
+              <w:t xml:space="preserve">Week 59</w:t>
+            </w:r>
+          </w:p>
+        </w:tc>
+        <w:tc>
+          <w:p>
+            <w:r>
+              <w:t xml:space="preserve">294</w:t>
+            </w:r>
+          </w:p>
+        </w:tc>
+        <w:tc>
+          <w:p>
+            <w:r>
+              <w:t xml:space="preserve">2</w:t>
+            </w:r>
+          </w:p>
+        </w:tc>
+      </w:tr>
+      <w:tr>
+        <w:tc>
+          <w:p>
+            <w:r>
+              <w:t xml:space="preserve">Week 60</w:t>
+            </w:r>
+          </w:p>
+        </w:tc>
+        <w:tc>
+          <w:p>
+            <w:r>
+              <w:t xml:space="preserve">297</w:t>
+            </w:r>
+          </w:p>
+        </w:tc>
+        <w:tc>
+          <w:p>
+            <w:r>
+              <w:t xml:space="preserve">3</w:t>
+            </w:r>
+          </w:p>
+        </w:tc>
+      </w:tr>
+    </w:tbl>
     <w:p>
       <w:pPr>
         <w:pStyle w:val="Heading1"/>

</xml_diff>